<commit_message>
Add configuration management and refactor context handling for report generation
- Introduced `coa_config.py` for managing application configuration and paths.
- Added `coa_context.py` to handle context building for report generation, including quantity management.
- Created utility functions in `coa_utils.py` for input validation and formatting.
- Updated `app.py` to integrate new configuration and context handling.
- Enhanced test coverage for new features in `test_app.py`.
- Updated templates and configuration files to support new functionality.
</commit_message>
<xml_diff>
--- a/templates/COA_Etacom_template.docx
+++ b/templates/COA_Etacom_template.docx
@@ -7,27 +7,27 @@
         <w:ind w:firstLineChars="1400" w:firstLine="3080"/>
         <w:jc w:val="right"/>
         <w:rPr>
-          <w:rFonts w:ascii="BiauKai" w:eastAsia="BiauKai" w:hAnsi="BiauKai"/>
+          <w:rFonts w:ascii="DFKai-SB" w:eastAsia="DFKai-SB" w:hAnsi="DFKai-SB"/>
           <w:sz w:val="22"/>
         </w:rPr>
       </w:pPr>
       <w:r>
         <w:rPr>
-          <w:rFonts w:ascii="BiauKai" w:eastAsia="BiauKai" w:hAnsi="BiauKai" w:hint="eastAsia"/>
+          <w:rFonts w:ascii="DFKai-SB" w:eastAsia="DFKai-SB" w:hAnsi="DFKai-SB" w:hint="eastAsia"/>
           <w:sz w:val="22"/>
         </w:rPr>
         <w:t xml:space="preserve">             </w:t>
       </w:r>
       <w:r>
         <w:rPr>
-          <w:rFonts w:ascii="BiauKai" w:eastAsia="BiauKai" w:hAnsi="BiauKai" w:hint="eastAsia"/>
+          <w:rFonts w:ascii="DFKai-SB" w:eastAsia="DFKai-SB" w:hAnsi="DFKai-SB" w:hint="eastAsia"/>
           <w:sz w:val="22"/>
         </w:rPr>
         <w:t xml:space="preserve">  </w:t>
       </w:r>
       <w:r>
         <w:rPr>
-          <w:rFonts w:ascii="BiauKai" w:eastAsia="BiauKai" w:hAnsi="BiauKai" w:hint="eastAsia"/>
+          <w:rFonts w:ascii="DFKai-SB" w:eastAsia="DFKai-SB" w:hAnsi="DFKai-SB" w:hint="eastAsia"/>
           <w:sz w:val="22"/>
         </w:rPr>
         <w:t xml:space="preserve"> </w:t>
@@ -37,48 +37,48 @@
       <w:pPr>
         <w:ind w:firstLineChars="1063" w:firstLine="2551"/>
         <w:rPr>
-          <w:rFonts w:ascii="BiauKai" w:eastAsia="BiauKai" w:hAnsi="BiauKai" w:cs="Arial"/>
-          <w:szCs w:val="24"/>
-        </w:rPr>
-      </w:pPr>
-      <w:r>
-        <w:rPr>
-          <w:rFonts w:ascii="BiauKai" w:eastAsia="BiauKai" w:hAnsi="BiauKai" w:cs="Arial"/>
+          <w:rFonts w:ascii="DFKai-SB" w:eastAsia="DFKai-SB" w:hAnsi="DFKai-SB" w:cs="Arial"/>
+          <w:szCs w:val="24"/>
+        </w:rPr>
+      </w:pPr>
+      <w:r>
+        <w:rPr>
+          <w:rFonts w:ascii="DFKai-SB" w:eastAsia="DFKai-SB" w:hAnsi="DFKai-SB" w:cs="Arial"/>
           <w:szCs w:val="24"/>
         </w:rPr>
         <w:t>客戶名稱</w:t>
       </w:r>
       <w:r>
         <w:rPr>
-          <w:rFonts w:ascii="BiauKai" w:eastAsia="BiauKai" w:hAnsi="BiauKai" w:cs="Arial"/>
+          <w:rFonts w:ascii="DFKai-SB" w:eastAsia="DFKai-SB" w:hAnsi="DFKai-SB" w:cs="Arial"/>
           <w:szCs w:val="24"/>
         </w:rPr>
         <w:t>：</w:t>
       </w:r>
       <w:r>
         <w:rPr>
-          <w:rFonts w:ascii="BiauKai" w:eastAsia="BiauKai" w:hAnsi="BiauKai" w:cs="Arial"/>
+          <w:rFonts w:ascii="DFKai-SB" w:eastAsia="DFKai-SB" w:hAnsi="DFKai-SB" w:cs="Arial"/>
           <w:szCs w:val="24"/>
         </w:rPr>
         <w:t xml:space="preserve"> </w:t>
       </w:r>
       <w:r>
         <w:rPr>
-          <w:rFonts w:ascii="BiauKai" w:eastAsia="BiauKai" w:hAnsi="BiauKai" w:cs="Arial" w:hint="eastAsia"/>
+          <w:rFonts w:ascii="DFKai-SB" w:eastAsia="DFKai-SB" w:hAnsi="DFKai-SB" w:cs="Arial" w:hint="eastAsia"/>
           <w:szCs w:val="24"/>
         </w:rPr>
         <w:t>安達康</w:t>
       </w:r>
       <w:r>
         <w:rPr>
-          <w:rFonts w:ascii="BiauKai" w:eastAsia="BiauKai" w:hAnsi="BiauKai" w:cs="Arial" w:hint="eastAsia"/>
+          <w:rFonts w:ascii="DFKai-SB" w:eastAsia="DFKai-SB" w:hAnsi="DFKai-SB" w:cs="Arial" w:hint="eastAsia"/>
           <w:szCs w:val="24"/>
         </w:rPr>
         <w:t>科技</w:t>
       </w:r>
       <w:r>
         <w:rPr>
-          <w:rFonts w:ascii="BiauKai" w:eastAsia="BiauKai" w:hAnsi="BiauKai" w:cs="Arial"/>
+          <w:rFonts w:ascii="DFKai-SB" w:eastAsia="DFKai-SB" w:hAnsi="DFKai-SB" w:cs="Arial"/>
           <w:szCs w:val="24"/>
         </w:rPr>
         <w:t>股份有限公司</w:t>
@@ -94,7 +94,7 @@
       </w:pPr>
       <w:r>
         <w:rPr>
-          <w:rFonts w:ascii="BiauKai" w:eastAsia="BiauKai" w:hAnsi="BiauKai" w:cs="Arial" w:hint="eastAsia"/>
+          <w:rFonts w:ascii="DFKai-SB" w:eastAsia="DFKai-SB" w:hAnsi="DFKai-SB" w:cs="Arial" w:hint="eastAsia"/>
           <w:szCs w:val="24"/>
         </w:rPr>
         <w:t>品名：</w:t>
@@ -125,7 +125,7 @@
       </w:pPr>
       <w:r>
         <w:rPr>
-          <w:rFonts w:ascii="BiauKai" w:eastAsia="BiauKai" w:hAnsi="BiauKai" w:cs="Arial"/>
+          <w:rFonts w:ascii="DFKai-SB" w:eastAsia="DFKai-SB" w:hAnsi="DFKai-SB" w:cs="Arial"/>
           <w:szCs w:val="24"/>
         </w:rPr>
         <w:t>日期：</w:t>
@@ -149,21 +149,21 @@
       </w:pPr>
       <w:r>
         <w:rPr>
-          <w:rFonts w:ascii="BiauKai" w:eastAsia="BiauKai" w:hAnsi="BiauKai" w:cs="Arial" w:hint="eastAsia"/>
+          <w:rFonts w:ascii="DFKai-SB" w:eastAsia="DFKai-SB" w:hAnsi="DFKai-SB" w:cs="Arial" w:hint="eastAsia"/>
           <w:szCs w:val="24"/>
         </w:rPr>
         <w:t>批</w:t>
       </w:r>
       <w:r>
         <w:rPr>
-          <w:rFonts w:ascii="BiauKai" w:eastAsia="BiauKai" w:hAnsi="BiauKai" w:cs="Arial"/>
+          <w:rFonts w:ascii="DFKai-SB" w:eastAsia="DFKai-SB" w:hAnsi="DFKai-SB" w:cs="Arial"/>
           <w:szCs w:val="24"/>
         </w:rPr>
         <w:t>號</w:t>
       </w:r>
       <w:r>
         <w:rPr>
-          <w:rFonts w:ascii="BiauKai" w:eastAsia="BiauKai" w:hAnsi="BiauKai" w:cs="Arial"/>
+          <w:rFonts w:ascii="DFKai-SB" w:eastAsia="DFKai-SB" w:hAnsi="DFKai-SB" w:cs="Arial"/>
           <w:szCs w:val="24"/>
         </w:rPr>
         <w:t>：</w:t>
@@ -187,14 +187,14 @@
       </w:pPr>
       <w:r>
         <w:rPr>
-          <w:rFonts w:ascii="BiauKai" w:eastAsia="BiauKai" w:hAnsi="BiauKai" w:cs="Arial" w:hint="eastAsia"/>
+          <w:rFonts w:ascii="DFKai-SB" w:eastAsia="DFKai-SB" w:hAnsi="DFKai-SB" w:cs="Arial" w:hint="eastAsia"/>
           <w:szCs w:val="24"/>
         </w:rPr>
         <w:t>重量</w:t>
       </w:r>
       <w:r>
         <w:rPr>
-          <w:rFonts w:ascii="BiauKai" w:eastAsia="BiauKai" w:hAnsi="BiauKai" w:cs="Arial"/>
+          <w:rFonts w:ascii="DFKai-SB" w:eastAsia="DFKai-SB" w:hAnsi="DFKai-SB" w:cs="Arial"/>
           <w:szCs w:val="24"/>
         </w:rPr>
         <w:t>：</w:t>
@@ -204,13 +204,27 @@
           <w:rFonts w:ascii="Arial" w:eastAsia="BiauKai" w:hAnsi="Arial" w:cs="Arial"/>
           <w:szCs w:val="24"/>
         </w:rPr>
-        <w:t>{{ weight }}</w:t>
+        <w:t>{{ weight }}{% if qty %}*{{ qty }}</w:t>
+      </w:r>
+      <w:r>
+        <w:rPr>
+          <w:rFonts w:ascii="Arial" w:eastAsia="BiauKai" w:hAnsi="Arial" w:cs="Arial"/>
+          <w:szCs w:val="24"/>
+        </w:rPr>
+        <w:t>桶</w:t>
+      </w:r>
+      <w:r>
+        <w:rPr>
+          <w:rFonts w:ascii="Arial" w:eastAsia="BiauKai" w:hAnsi="Arial" w:cs="Arial"/>
+          <w:szCs w:val="24"/>
+        </w:rPr>
+        <w:t>{% endif %}</w:t>
       </w:r>
     </w:p>
     <w:p>
       <w:pPr>
         <w:rPr>
-          <w:rFonts w:ascii="BiauKai" w:eastAsia="BiauKai" w:hAnsi="BiauKai" w:cs="Arial"/>
+          <w:rFonts w:ascii="DFKai-SB" w:eastAsia="DFKai-SB" w:hAnsi="DFKai-SB" w:cs="Arial"/>
           <w:szCs w:val="24"/>
         </w:rPr>
       </w:pPr>
@@ -218,7 +232,7 @@
     <w:p>
       <w:pPr>
         <w:rPr>
-          <w:rFonts w:ascii="BiauKai" w:eastAsia="BiauKai" w:hAnsi="BiauKai" w:cs="Arial"/>
+          <w:rFonts w:ascii="DFKai-SB" w:eastAsia="DFKai-SB" w:hAnsi="DFKai-SB" w:cs="Arial"/>
           <w:szCs w:val="24"/>
         </w:rPr>
       </w:pPr>
@@ -257,13 +271,13 @@
             <w:pPr>
               <w:jc w:val="center"/>
               <w:rPr>
-                <w:rFonts w:ascii="BiauKai" w:eastAsia="BiauKai" w:hAnsi="BiauKai" w:cs="Arial"/>
+                <w:rFonts w:ascii="DFKai-SB" w:eastAsia="DFKai-SB" w:hAnsi="DFKai-SB" w:cs="Arial"/>
                 <w:szCs w:val="24"/>
               </w:rPr>
             </w:pPr>
             <w:r>
               <w:rPr>
-                <w:rFonts w:ascii="BiauKai" w:eastAsia="BiauKai" w:hAnsi="BiauKai" w:cs="Arial" w:hint="eastAsia"/>
+                <w:rFonts w:ascii="DFKai-SB" w:eastAsia="DFKai-SB" w:hAnsi="DFKai-SB" w:cs="Arial" w:hint="eastAsia"/>
                 <w:szCs w:val="24"/>
               </w:rPr>
               <w:t>檢查項目</w:t>
@@ -282,13 +296,13 @@
             <w:pPr>
               <w:jc w:val="center"/>
               <w:rPr>
-                <w:rFonts w:ascii="BiauKai" w:eastAsia="BiauKai" w:hAnsi="BiauKai" w:cs="Arial"/>
+                <w:rFonts w:ascii="DFKai-SB" w:eastAsia="DFKai-SB" w:hAnsi="DFKai-SB" w:cs="Arial"/>
                 <w:szCs w:val="24"/>
               </w:rPr>
             </w:pPr>
             <w:r>
               <w:rPr>
-                <w:rFonts w:ascii="BiauKai" w:eastAsia="BiauKai" w:hAnsi="BiauKai" w:cs="Arial" w:hint="eastAsia"/>
+                <w:rFonts w:ascii="DFKai-SB" w:eastAsia="DFKai-SB" w:hAnsi="DFKai-SB" w:cs="Arial" w:hint="eastAsia"/>
                 <w:szCs w:val="24"/>
               </w:rPr>
               <w:t>規格</w:t>
@@ -307,13 +321,13 @@
             <w:pPr>
               <w:jc w:val="center"/>
               <w:rPr>
-                <w:rFonts w:ascii="BiauKai" w:eastAsia="BiauKai" w:hAnsi="BiauKai" w:cs="Arial"/>
+                <w:rFonts w:ascii="DFKai-SB" w:eastAsia="DFKai-SB" w:hAnsi="DFKai-SB" w:cs="Arial"/>
                 <w:szCs w:val="24"/>
               </w:rPr>
             </w:pPr>
             <w:r>
               <w:rPr>
-                <w:rFonts w:ascii="BiauKai" w:eastAsia="BiauKai" w:hAnsi="BiauKai" w:cs="Arial" w:hint="eastAsia"/>
+                <w:rFonts w:ascii="DFKai-SB" w:eastAsia="DFKai-SB" w:hAnsi="DFKai-SB" w:cs="Arial" w:hint="eastAsia"/>
                 <w:szCs w:val="24"/>
               </w:rPr>
               <w:t>結果</w:t>
@@ -338,20 +352,20 @@
             <w:pPr>
               <w:ind w:firstLineChars="100" w:firstLine="240"/>
               <w:rPr>
-                <w:rFonts w:ascii="BiauKai" w:eastAsia="BiauKai" w:hAnsi="BiauKai" w:cs="Arial"/>
+                <w:rFonts w:ascii="DFKai-SB" w:eastAsia="DFKai-SB" w:hAnsi="DFKai-SB" w:cs="Arial"/>
                 <w:szCs w:val="24"/>
               </w:rPr>
             </w:pPr>
             <w:r>
               <w:rPr>
-                <w:rFonts w:ascii="BiauKai" w:eastAsia="BiauKai" w:hAnsi="BiauKai" w:cs="Arial" w:hint="eastAsia"/>
+                <w:rFonts w:ascii="DFKai-SB" w:eastAsia="DFKai-SB" w:hAnsi="DFKai-SB" w:cs="Arial" w:hint="eastAsia"/>
                 <w:szCs w:val="24"/>
               </w:rPr>
               <w:t>黏度</w:t>
             </w:r>
             <w:r>
               <w:rPr>
-                <w:rFonts w:ascii="BiauKai" w:eastAsia="BiauKai" w:hAnsi="BiauKai" w:cs="Arial"/>
+                <w:rFonts w:ascii="DFKai-SB" w:eastAsia="DFKai-SB" w:hAnsi="DFKai-SB" w:cs="Arial"/>
                 <w:szCs w:val="24"/>
               </w:rPr>
               <w:t>(25℃)</w:t>
@@ -371,41 +385,41 @@
             <w:pPr>
               <w:jc w:val="center"/>
               <w:rPr>
-                <w:rFonts w:ascii="BiauKai" w:eastAsia="BiauKai" w:hAnsi="BiauKai" w:cs="Arial"/>
+                <w:rFonts w:ascii="DFKai-SB" w:eastAsia="DFKai-SB" w:hAnsi="DFKai-SB" w:cs="Arial"/>
                 <w:szCs w:val="24"/>
               </w:rPr>
             </w:pPr>
             <w:r>
               <w:rPr>
-                <w:rFonts w:ascii="BiauKai" w:eastAsia="BiauKai" w:hAnsi="BiauKai" w:cs="Arial"/>
+                <w:rFonts w:ascii="DFKai-SB" w:eastAsia="DFKai-SB" w:hAnsi="DFKai-SB" w:cs="Arial"/>
                 <w:szCs w:val="24"/>
               </w:rPr>
               <w:t xml:space="preserve">{{ </w:t>
             </w:r>
             <w:r>
               <w:rPr>
-                <w:rFonts w:ascii="BiauKai" w:eastAsia="BiauKai" w:hAnsi="BiauKai" w:cs="Arial"/>
+                <w:rFonts w:ascii="DFKai-SB" w:eastAsia="DFKai-SB" w:hAnsi="DFKai-SB" w:cs="Arial"/>
                 <w:szCs w:val="24"/>
               </w:rPr>
               <w:t>viscosity_range</w:t>
             </w:r>
             <w:r>
               <w:rPr>
-                <w:rFonts w:ascii="BiauKai" w:eastAsia="BiauKai" w:hAnsi="BiauKai" w:cs="Arial"/>
+                <w:rFonts w:ascii="DFKai-SB" w:eastAsia="DFKai-SB" w:hAnsi="DFKai-SB" w:cs="Arial"/>
                 <w:szCs w:val="24"/>
               </w:rPr>
               <w:t>}}</w:t>
             </w:r>
             <w:r>
               <w:rPr>
-                <w:rFonts w:ascii="BiauKai" w:eastAsia="BiauKai" w:hAnsi="BiauKai" w:cs="Arial"/>
+                <w:rFonts w:ascii="DFKai-SB" w:eastAsia="DFKai-SB" w:hAnsi="DFKai-SB" w:cs="Arial"/>
                 <w:szCs w:val="24"/>
               </w:rPr>
               <w:t xml:space="preserve"> cP</w:t>
             </w:r>
             <w:r>
               <w:rPr>
-                <w:rFonts w:ascii="BiauKai" w:eastAsia="BiauKai" w:hAnsi="BiauKai" w:cs="Arial"/>
+                <w:rFonts w:ascii="DFKai-SB" w:eastAsia="DFKai-SB" w:hAnsi="DFKai-SB" w:cs="Arial"/>
                 <w:szCs w:val="24"/>
               </w:rPr>
               <w:t>s</w:t>
@@ -425,27 +439,27 @@
             <w:pPr>
               <w:jc w:val="center"/>
               <w:rPr>
-                <w:rFonts w:ascii="BiauKai" w:eastAsia="BiauKai" w:hAnsi="BiauKai" w:cs="Arial"/>
+                <w:rFonts w:ascii="DFKai-SB" w:eastAsia="DFKai-SB" w:hAnsi="DFKai-SB" w:cs="Arial"/>
                 <w:szCs w:val="24"/>
               </w:rPr>
             </w:pPr>
             <w:r>
               <w:rPr>
-                <w:rFonts w:ascii="BiauKai" w:eastAsia="BiauKai" w:hAnsi="BiauKai" w:cs="Arial"/>
+                <w:rFonts w:ascii="DFKai-SB" w:eastAsia="DFKai-SB" w:hAnsi="DFKai-SB" w:cs="Arial"/>
                 <w:szCs w:val="24"/>
               </w:rPr>
               <w:t>{{ viscosity }}</w:t>
             </w:r>
             <w:r>
               <w:rPr>
-                <w:rFonts w:ascii="BiauKai" w:eastAsia="BiauKai" w:hAnsi="BiauKai" w:cs="Arial" w:hint="eastAsia"/>
+                <w:rFonts w:ascii="DFKai-SB" w:eastAsia="DFKai-SB" w:hAnsi="DFKai-SB" w:cs="Arial" w:hint="eastAsia"/>
                 <w:szCs w:val="24"/>
               </w:rPr>
               <w:t xml:space="preserve"> cP</w:t>
             </w:r>
             <w:r>
               <w:rPr>
-                <w:rFonts w:ascii="BiauKai" w:eastAsia="BiauKai" w:hAnsi="BiauKai" w:cs="Arial" w:hint="eastAsia"/>
+                <w:rFonts w:ascii="DFKai-SB" w:eastAsia="DFKai-SB" w:hAnsi="DFKai-SB" w:cs="Arial" w:hint="eastAsia"/>
                 <w:szCs w:val="24"/>
               </w:rPr>
               <w:t>s</w:t>
@@ -470,13 +484,13 @@
             <w:pPr>
               <w:ind w:firstLineChars="100" w:firstLine="240"/>
               <w:rPr>
-                <w:rFonts w:ascii="BiauKai" w:eastAsia="BiauKai" w:hAnsi="BiauKai" w:cs="Arial"/>
+                <w:rFonts w:ascii="DFKai-SB" w:eastAsia="DFKai-SB" w:hAnsi="DFKai-SB" w:cs="Arial"/>
                 <w:szCs w:val="24"/>
               </w:rPr>
             </w:pPr>
             <w:r>
               <w:rPr>
-                <w:rFonts w:ascii="BiauKai" w:eastAsia="BiauKai" w:hAnsi="BiauKai" w:cs="Arial" w:hint="eastAsia"/>
+                <w:rFonts w:ascii="DFKai-SB" w:eastAsia="DFKai-SB" w:hAnsi="DFKai-SB" w:cs="Arial" w:hint="eastAsia"/>
                 <w:szCs w:val="24"/>
               </w:rPr>
               <w:t>外觀</w:t>
@@ -496,14 +510,14 @@
             <w:pPr>
               <w:jc w:val="center"/>
               <w:rPr>
-                <w:rFonts w:ascii="BiauKai" w:eastAsia="BiauKai" w:hAnsi="BiauKai" w:cs="Arial"/>
+                <w:rFonts w:ascii="DFKai-SB" w:eastAsia="DFKai-SB" w:hAnsi="DFKai-SB" w:cs="Arial"/>
                 <w:szCs w:val="24"/>
                 <w:lang w:val="en-AU"/>
               </w:rPr>
             </w:pPr>
             <w:r>
               <w:rPr>
-                <w:rFonts w:ascii="BiauKai" w:eastAsia="BiauKai" w:hAnsi="BiauKai" w:cs="Arial"/>
+                <w:rFonts w:ascii="DFKai-SB" w:eastAsia="DFKai-SB" w:hAnsi="DFKai-SB" w:cs="Arial"/>
                 <w:szCs w:val="24"/>
                 <w:lang w:val="en-AU"/>
               </w:rPr>
@@ -524,13 +538,13 @@
             <w:pPr>
               <w:jc w:val="center"/>
               <w:rPr>
-                <w:rFonts w:ascii="BiauKai" w:eastAsia="BiauKai" w:hAnsi="BiauKai" w:cs="Arial"/>
+                <w:rFonts w:ascii="DFKai-SB" w:eastAsia="DFKai-SB" w:hAnsi="DFKai-SB" w:cs="Arial"/>
                 <w:szCs w:val="24"/>
               </w:rPr>
             </w:pPr>
             <w:r>
               <w:rPr>
-                <w:rFonts w:ascii="BiauKai" w:eastAsia="BiauKai" w:hAnsi="BiauKai" w:cs="Arial"/>
+                <w:rFonts w:ascii="DFKai-SB" w:eastAsia="DFKai-SB" w:hAnsi="DFKai-SB" w:cs="Arial"/>
                 <w:szCs w:val="24"/>
                 <w:lang w:val="en-AU"/>
               </w:rPr>
@@ -538,7 +552,7 @@
             </w:r>
             <w:r>
               <w:rPr>
-                <w:rFonts w:ascii="BiauKai" w:eastAsia="BiauKai" w:hAnsi="BiauKai" w:cs="Arial"/>
+                <w:rFonts w:ascii="DFKai-SB" w:eastAsia="DFKai-SB" w:hAnsi="DFKai-SB" w:cs="Arial"/>
                 <w:szCs w:val="24"/>
                 <w:lang w:val="en-AU"/>
               </w:rPr>
@@ -546,7 +560,7 @@
             </w:r>
             <w:r>
               <w:rPr>
-                <w:rFonts w:ascii="BiauKai" w:eastAsia="BiauKai" w:hAnsi="BiauKai" w:cs="Arial"/>
+                <w:rFonts w:ascii="DFKai-SB" w:eastAsia="DFKai-SB" w:hAnsi="DFKai-SB" w:cs="Arial"/>
                 <w:szCs w:val="24"/>
                 <w:lang w:val="en-AU"/>
               </w:rPr>
@@ -572,13 +586,13 @@
             <w:pPr>
               <w:ind w:firstLineChars="100" w:firstLine="240"/>
               <w:rPr>
-                <w:rFonts w:ascii="BiauKai" w:eastAsia="BiauKai" w:hAnsi="BiauKai"/>
+                <w:rFonts w:ascii="DFKai-SB" w:eastAsia="DFKai-SB" w:hAnsi="DFKai-SB"/>
                 <w:szCs w:val="24"/>
               </w:rPr>
             </w:pPr>
             <w:r>
               <w:rPr>
-                <w:rFonts w:ascii="BiauKai" w:eastAsia="BiauKai" w:hAnsi="BiauKai" w:hint="eastAsia"/>
+                <w:rFonts w:ascii="DFKai-SB" w:eastAsia="DFKai-SB" w:hAnsi="DFKai-SB" w:hint="eastAsia"/>
                 <w:szCs w:val="24"/>
               </w:rPr>
               <w:t>硬度(Shore-D)</w:t>
@@ -587,41 +601,41 @@
           <w:p>
             <w:pPr>
               <w:rPr>
-                <w:rFonts w:ascii="BiauKai" w:eastAsia="BiauKai" w:hAnsi="BiauKai" w:cs="Arial"/>
+                <w:rFonts w:ascii="DFKai-SB" w:eastAsia="DFKai-SB" w:hAnsi="DFKai-SB" w:cs="Arial"/>
                 <w:szCs w:val="24"/>
               </w:rPr>
             </w:pPr>
             <w:r>
               <w:rPr>
-                <w:rFonts w:ascii="BiauKai" w:eastAsia="BiauKai" w:hAnsi="BiauKai"/>
+                <w:rFonts w:ascii="DFKai-SB" w:eastAsia="DFKai-SB" w:hAnsi="DFKai-SB"/>
                 <w:szCs w:val="24"/>
               </w:rPr>
               <w:t xml:space="preserve">  </w:t>
             </w:r>
             <w:r>
               <w:rPr>
-                <w:rFonts w:ascii="BiauKai" w:eastAsia="BiauKai" w:hAnsi="BiauKai"/>
+                <w:rFonts w:ascii="DFKai-SB" w:eastAsia="DFKai-SB" w:hAnsi="DFKai-SB"/>
                 <w:szCs w:val="24"/>
               </w:rPr>
               <w:t>C</w:t>
             </w:r>
             <w:r>
               <w:rPr>
-                <w:rFonts w:ascii="BiauKai" w:eastAsia="BiauKai" w:hAnsi="BiauKai" w:hint="eastAsia"/>
+                <w:rFonts w:ascii="DFKai-SB" w:eastAsia="DFKai-SB" w:hAnsi="DFKai-SB" w:hint="eastAsia"/>
                 <w:szCs w:val="24"/>
               </w:rPr>
               <w:t>ouple: H</w:t>
             </w:r>
             <w:r>
               <w:rPr>
-                <w:rFonts w:ascii="BiauKai" w:eastAsia="BiauKai" w:hAnsi="BiauKai" w:hint="eastAsia"/>
+                <w:rFonts w:ascii="DFKai-SB" w:eastAsia="DFKai-SB" w:hAnsi="DFKai-SB" w:hint="eastAsia"/>
                 <w:szCs w:val="24"/>
               </w:rPr>
               <w:t>Y25</w:t>
             </w:r>
             <w:r>
               <w:rPr>
-                <w:rFonts w:ascii="BiauKai" w:eastAsia="BiauKai" w:hAnsi="BiauKai" w:hint="eastAsia"/>
+                <w:rFonts w:ascii="DFKai-SB" w:eastAsia="DFKai-SB" w:hAnsi="DFKai-SB" w:hint="eastAsia"/>
                 <w:szCs w:val="24"/>
               </w:rPr>
               <w:t>36</w:t>
@@ -641,13 +655,13 @@
             <w:pPr>
               <w:jc w:val="center"/>
               <w:rPr>
-                <w:rFonts w:ascii="BiauKai" w:eastAsia="BiauKai" w:hAnsi="BiauKai" w:cs="Arial"/>
+                <w:rFonts w:ascii="DFKai-SB" w:eastAsia="DFKai-SB" w:hAnsi="DFKai-SB" w:cs="Arial"/>
                 <w:szCs w:val="24"/>
               </w:rPr>
             </w:pPr>
             <w:r>
               <w:rPr>
-                <w:rFonts w:ascii="BiauKai" w:eastAsia="BiauKai" w:hAnsi="BiauKai" w:cs="Arial"/>
+                <w:rFonts w:ascii="DFKai-SB" w:eastAsia="DFKai-SB" w:hAnsi="DFKai-SB" w:cs="Arial"/>
                 <w:szCs w:val="24"/>
               </w:rPr>
               <w:t>{{ hardness }}</w:t>
@@ -667,27 +681,27 @@
             <w:pPr>
               <w:jc w:val="center"/>
               <w:rPr>
-                <w:rFonts w:ascii="BiauKai" w:eastAsia="BiauKai" w:hAnsi="BiauKai" w:cs="Arial"/>
+                <w:rFonts w:ascii="DFKai-SB" w:eastAsia="DFKai-SB" w:hAnsi="DFKai-SB" w:cs="Arial"/>
                 <w:szCs w:val="24"/>
               </w:rPr>
             </w:pPr>
             <w:r>
               <w:rPr>
-                <w:rFonts w:ascii="BiauKai" w:eastAsia="BiauKai" w:hAnsi="BiauKai" w:cs="Arial" w:hint="eastAsia"/>
+                <w:rFonts w:ascii="DFKai-SB" w:eastAsia="DFKai-SB" w:hAnsi="DFKai-SB" w:cs="Arial" w:hint="eastAsia"/>
                 <w:szCs w:val="24"/>
               </w:rPr>
               <w:t>D-</w:t>
             </w:r>
             <w:r>
               <w:rPr>
-                <w:rFonts w:ascii="BiauKai" w:eastAsia="BiauKai" w:hAnsi="BiauKai" w:cs="Arial" w:hint="eastAsia"/>
+                <w:rFonts w:ascii="DFKai-SB" w:eastAsia="DFKai-SB" w:hAnsi="DFKai-SB" w:cs="Arial" w:hint="eastAsia"/>
                 <w:szCs w:val="24"/>
               </w:rPr>
               <w:t>7</w:t>
             </w:r>
             <w:r>
               <w:rPr>
-                <w:rFonts w:ascii="BiauKai" w:eastAsia="BiauKai" w:hAnsi="BiauKai" w:cs="Arial" w:hint="eastAsia"/>
+                <w:rFonts w:ascii="DFKai-SB" w:eastAsia="DFKai-SB" w:hAnsi="DFKai-SB" w:cs="Arial" w:hint="eastAsia"/>
                 <w:szCs w:val="24"/>
               </w:rPr>
               <w:t>2</w:t>
@@ -712,34 +726,34 @@
             <w:pPr>
               <w:ind w:firstLineChars="100" w:firstLine="240"/>
               <w:rPr>
-                <w:rFonts w:ascii="BiauKai" w:eastAsia="BiauKai" w:hAnsi="BiauKai"/>
+                <w:rFonts w:ascii="DFKai-SB" w:eastAsia="DFKai-SB" w:hAnsi="DFKai-SB"/>
                 <w:szCs w:val="24"/>
               </w:rPr>
             </w:pPr>
             <w:r>
               <w:rPr>
-                <w:rFonts w:ascii="BiauKai" w:eastAsia="BiauKai" w:hAnsi="BiauKai" w:hint="eastAsia"/>
+                <w:rFonts w:ascii="DFKai-SB" w:eastAsia="DFKai-SB" w:hAnsi="DFKai-SB" w:hint="eastAsia"/>
                 <w:szCs w:val="24"/>
               </w:rPr>
               <w:t>凝膠時間</w:t>
             </w:r>
             <w:r>
               <w:rPr>
-                <w:rFonts w:ascii="BiauKai" w:eastAsia="BiauKai" w:hAnsi="BiauKai" w:hint="eastAsia"/>
+                <w:rFonts w:ascii="DFKai-SB" w:eastAsia="DFKai-SB" w:hAnsi="DFKai-SB" w:hint="eastAsia"/>
                 <w:szCs w:val="24"/>
               </w:rPr>
               <w:t>(1</w:t>
             </w:r>
             <w:r>
               <w:rPr>
-                <w:rFonts w:ascii="BiauKai" w:eastAsia="BiauKai" w:hAnsi="BiauKai" w:hint="eastAsia"/>
+                <w:rFonts w:ascii="DFKai-SB" w:eastAsia="DFKai-SB" w:hAnsi="DFKai-SB" w:hint="eastAsia"/>
                 <w:szCs w:val="24"/>
               </w:rPr>
               <w:t>1</w:t>
             </w:r>
             <w:r>
               <w:rPr>
-                <w:rFonts w:ascii="BiauKai" w:eastAsia="BiauKai" w:hAnsi="BiauKai" w:hint="eastAsia"/>
+                <w:rFonts w:ascii="DFKai-SB" w:eastAsia="DFKai-SB" w:hAnsi="DFKai-SB" w:hint="eastAsia"/>
                 <w:szCs w:val="24"/>
               </w:rPr>
               <w:t>0℃)</w:t>
@@ -759,20 +773,20 @@
             <w:pPr>
               <w:jc w:val="center"/>
               <w:rPr>
-                <w:rFonts w:ascii="BiauKai" w:eastAsia="BiauKai" w:hAnsi="BiauKai" w:cs="Arial"/>
+                <w:rFonts w:ascii="DFKai-SB" w:eastAsia="DFKai-SB" w:hAnsi="DFKai-SB" w:cs="Arial"/>
                 <w:szCs w:val="24"/>
               </w:rPr>
             </w:pPr>
             <w:r>
               <w:rPr>
-                <w:rFonts w:ascii="BiauKai" w:eastAsia="BiauKai" w:hAnsi="BiauKai" w:cs="Arial"/>
+                <w:rFonts w:ascii="DFKai-SB" w:eastAsia="DFKai-SB" w:hAnsi="DFKai-SB" w:cs="Arial"/>
                 <w:szCs w:val="24"/>
               </w:rPr>
               <w:t>{{ gel_time_range }}</w:t>
             </w:r>
             <w:r>
               <w:rPr>
-                <w:rFonts w:ascii="BiauKai" w:eastAsia="BiauKai" w:hAnsi="BiauKai" w:cs="Arial" w:hint="eastAsia"/>
+                <w:rFonts w:ascii="DFKai-SB" w:eastAsia="DFKai-SB" w:hAnsi="DFKai-SB" w:cs="Arial" w:hint="eastAsia"/>
                 <w:szCs w:val="24"/>
               </w:rPr>
               <w:t xml:space="preserve"> sec</w:t>
@@ -792,20 +806,20 @@
             <w:pPr>
               <w:jc w:val="center"/>
               <w:rPr>
-                <w:rFonts w:ascii="BiauKai" w:eastAsia="BiauKai" w:hAnsi="BiauKai" w:cs="Arial"/>
+                <w:rFonts w:ascii="DFKai-SB" w:eastAsia="DFKai-SB" w:hAnsi="DFKai-SB" w:cs="Arial"/>
                 <w:szCs w:val="24"/>
               </w:rPr>
             </w:pPr>
             <w:r>
               <w:rPr>
-                <w:rFonts w:ascii="BiauKai" w:eastAsia="BiauKai" w:hAnsi="BiauKai" w:cs="Arial"/>
+                <w:rFonts w:ascii="DFKai-SB" w:eastAsia="DFKai-SB" w:hAnsi="DFKai-SB" w:cs="Arial"/>
                 <w:szCs w:val="24"/>
               </w:rPr>
               <w:t>{{ gel_time }}</w:t>
             </w:r>
             <w:r>
               <w:rPr>
-                <w:rFonts w:ascii="BiauKai" w:eastAsia="BiauKai" w:hAnsi="BiauKai" w:cs="Arial" w:hint="eastAsia"/>
+                <w:rFonts w:ascii="DFKai-SB" w:eastAsia="DFKai-SB" w:hAnsi="DFKai-SB" w:cs="Arial" w:hint="eastAsia"/>
                 <w:szCs w:val="24"/>
               </w:rPr>
               <w:t xml:space="preserve"> sec</w:t>
@@ -817,7 +831,7 @@
     <w:p>
       <w:pPr>
         <w:rPr>
-          <w:rFonts w:ascii="BiauKai" w:eastAsia="BiauKai" w:hAnsi="BiauKai" w:cs="Arial"/>
+          <w:rFonts w:ascii="DFKai-SB" w:eastAsia="DFKai-SB" w:hAnsi="DFKai-SB" w:cs="Arial"/>
           <w:sz w:val="22"/>
           <w:szCs w:val="22"/>
         </w:rPr>
@@ -826,7 +840,7 @@
     <w:p>
       <w:pPr>
         <w:rPr>
-          <w:rFonts w:ascii="BiauKai" w:eastAsia="BiauKai" w:hAnsi="BiauKai" w:cs="Arial"/>
+          <w:rFonts w:ascii="DFKai-SB" w:eastAsia="DFKai-SB" w:hAnsi="DFKai-SB" w:cs="Arial"/>
           <w:sz w:val="22"/>
           <w:szCs w:val="22"/>
         </w:rPr>
@@ -835,7 +849,7 @@
     <w:p>
       <w:pPr>
         <w:rPr>
-          <w:rFonts w:ascii="BiauKai" w:eastAsia="BiauKai" w:hAnsi="BiauKai" w:cs="Arial"/>
+          <w:rFonts w:ascii="DFKai-SB" w:eastAsia="DFKai-SB" w:hAnsi="DFKai-SB" w:cs="Arial"/>
           <w:sz w:val="22"/>
           <w:szCs w:val="22"/>
         </w:rPr>
@@ -844,7 +858,7 @@
     <w:p>
       <w:pPr>
         <w:rPr>
-          <w:rFonts w:ascii="BiauKai" w:eastAsia="BiauKai" w:hAnsi="BiauKai" w:cs="Arial"/>
+          <w:rFonts w:ascii="DFKai-SB" w:eastAsia="DFKai-SB" w:hAnsi="DFKai-SB" w:cs="Arial"/>
           <w:sz w:val="22"/>
           <w:szCs w:val="22"/>
         </w:rPr>
@@ -853,7 +867,7 @@
     <w:p>
       <w:pPr>
         <w:rPr>
-          <w:rFonts w:ascii="BiauKai" w:eastAsia="BiauKai" w:hAnsi="BiauKai" w:cs="Arial"/>
+          <w:rFonts w:ascii="DFKai-SB" w:eastAsia="DFKai-SB" w:hAnsi="DFKai-SB" w:cs="Arial"/>
           <w:sz w:val="22"/>
           <w:szCs w:val="22"/>
         </w:rPr>
@@ -862,7 +876,7 @@
     <w:p>
       <w:pPr>
         <w:rPr>
-          <w:rFonts w:ascii="BiauKai" w:eastAsia="BiauKai" w:hAnsi="BiauKai" w:cs="Arial"/>
+          <w:rFonts w:ascii="DFKai-SB" w:eastAsia="DFKai-SB" w:hAnsi="DFKai-SB" w:cs="Arial"/>
           <w:sz w:val="22"/>
           <w:szCs w:val="22"/>
         </w:rPr>
@@ -871,7 +885,7 @@
     <w:p>
       <w:pPr>
         <w:rPr>
-          <w:rFonts w:ascii="BiauKai" w:eastAsia="BiauKai" w:hAnsi="BiauKai" w:cs="Arial"/>
+          <w:rFonts w:ascii="DFKai-SB" w:eastAsia="DFKai-SB" w:hAnsi="DFKai-SB" w:cs="Arial"/>
           <w:sz w:val="22"/>
           <w:szCs w:val="22"/>
         </w:rPr>
@@ -881,14 +895,14 @@
       <w:pPr>
         <w:ind w:left="1440" w:firstLine="480"/>
         <w:rPr>
-          <w:rFonts w:ascii="BiauKai" w:eastAsia="BiauKai" w:hAnsi="BiauKai" w:cs="Arial"/>
+          <w:rFonts w:ascii="DFKai-SB" w:eastAsia="DFKai-SB" w:hAnsi="DFKai-SB" w:cs="Arial"/>
           <w:sz w:val="22"/>
           <w:szCs w:val="22"/>
         </w:rPr>
       </w:pPr>
       <w:r>
         <w:rPr>
-          <w:rFonts w:ascii="BiauKai" w:eastAsia="BiauKai" w:hAnsi="BiauKai" w:cs="Arial" w:hint="eastAsia"/>
+          <w:rFonts w:ascii="DFKai-SB" w:eastAsia="DFKai-SB" w:hAnsi="DFKai-SB" w:cs="Arial" w:hint="eastAsia"/>
           <w:sz w:val="22"/>
           <w:szCs w:val="22"/>
         </w:rPr>
@@ -896,7 +910,7 @@
       </w:r>
       <w:r>
         <w:rPr>
-          <w:rFonts w:ascii="BiauKai" w:eastAsia="BiauKai" w:hAnsi="BiauKai" w:cs="Arial" w:hint="eastAsia"/>
+          <w:rFonts w:ascii="DFKai-SB" w:eastAsia="DFKai-SB" w:hAnsi="DFKai-SB" w:cs="Arial" w:hint="eastAsia"/>
           <w:sz w:val="22"/>
           <w:szCs w:val="22"/>
         </w:rPr>
@@ -904,7 +918,7 @@
       </w:r>
       <w:r>
         <w:rPr>
-          <w:rFonts w:ascii="BiauKai" w:eastAsia="BiauKai" w:hAnsi="BiauKai" w:cs="Arial" w:hint="eastAsia"/>
+          <w:rFonts w:ascii="DFKai-SB" w:eastAsia="DFKai-SB" w:hAnsi="DFKai-SB" w:cs="Arial" w:hint="eastAsia"/>
           <w:sz w:val="22"/>
           <w:szCs w:val="22"/>
         </w:rPr>
@@ -912,7 +926,7 @@
       </w:r>
       <w:r>
         <w:rPr>
-          <w:rFonts w:ascii="BiauKai" w:eastAsia="BiauKai" w:hAnsi="BiauKai" w:cs="Arial" w:hint="eastAsia"/>
+          <w:rFonts w:ascii="DFKai-SB" w:eastAsia="DFKai-SB" w:hAnsi="DFKai-SB" w:cs="Arial" w:hint="eastAsia"/>
           <w:sz w:val="22"/>
           <w:szCs w:val="22"/>
         </w:rPr>
@@ -920,7 +934,7 @@
       </w:r>
       <w:r>
         <w:rPr>
-          <w:rFonts w:ascii="BiauKai" w:eastAsia="BiauKai" w:hAnsi="BiauKai" w:cs="Arial" w:hint="eastAsia"/>
+          <w:rFonts w:ascii="DFKai-SB" w:eastAsia="DFKai-SB" w:hAnsi="DFKai-SB" w:cs="Arial" w:hint="eastAsia"/>
           <w:sz w:val="22"/>
           <w:szCs w:val="22"/>
         </w:rPr>
@@ -928,7 +942,7 @@
       </w:r>
       <w:r>
         <w:rPr>
-          <w:rFonts w:ascii="BiauKai" w:eastAsia="BiauKai" w:hAnsi="BiauKai" w:cs="Arial" w:hint="eastAsia"/>
+          <w:rFonts w:ascii="DFKai-SB" w:eastAsia="DFKai-SB" w:hAnsi="DFKai-SB" w:cs="Arial" w:hint="eastAsia"/>
           <w:sz w:val="22"/>
           <w:szCs w:val="22"/>
         </w:rPr>
@@ -939,7 +953,7 @@
     <w:p>
       <w:pPr>
         <w:rPr>
-          <w:rFonts w:ascii="BiauKai" w:eastAsia="BiauKai" w:hAnsi="BiauKai" w:cs="Arial"/>
+          <w:rFonts w:ascii="DFKai-SB" w:eastAsia="DFKai-SB" w:hAnsi="DFKai-SB" w:cs="Arial"/>
           <w:sz w:val="22"/>
           <w:szCs w:val="22"/>
         </w:rPr>
@@ -980,7 +994,7 @@
 <w:ftr xmlns:wpc="http://schemas.microsoft.com/office/word/2010/wordprocessingCanvas" xmlns:cx="http://schemas.microsoft.com/office/drawing/2014/chartex" xmlns:cx1="http://schemas.microsoft.com/office/drawing/2015/9/8/chartex" xmlns:cx2="http://schemas.microsoft.com/office/drawing/2015/10/21/chartex" xmlns:cx3="http://schemas.microsoft.com/office/drawing/2016/5/9/chartex" xmlns:cx4="http://schemas.microsoft.com/office/drawing/2016/5/10/chartex" xmlns:cx5="http://schemas.microsoft.com/office/drawing/2016/5/11/chartex" xmlns:cx6="http://schemas.microsoft.com/office/drawing/2016/5/12/chartex" xmlns:cx7="http://schemas.microsoft.com/office/drawing/2016/5/13/chartex" xmlns:cx8="http://schemas.microsoft.com/office/drawing/2016/5/14/chartex" xmlns:mc="http://schemas.openxmlformats.org/markup-compatibility/2006" xmlns:aink="http://schemas.microsoft.com/office/drawing/2016/ink" xmlns:am3d="http://schemas.microsoft.com/office/drawing/2017/model3d" xmlns:o="urn:schemas-microsoft-com:office:office" xmlns:oel="http://schemas.microsoft.com/office/2019/extlst" xmlns:r="http://schemas.openxmlformats.org/officeDocument/2006/relationships" xmlns:m="http://schemas.openxmlformats.org/officeDocument/2006/math" xmlns:v="urn:schemas-microsoft-com:vml" xmlns:wp14="http://schemas.microsoft.com/office/word/2010/wordprocessingDrawing" xmlns:wp="http://schemas.openxmlformats.org/drawingml/2006/wordprocessingDrawing" xmlns:w10="urn:schemas-microsoft-com:office:word" xmlns:w="http://schemas.openxmlformats.org/wordprocessingml/2006/main" xmlns:w14="http://schemas.microsoft.com/office/word/2010/wordml" xmlns:w15="http://schemas.microsoft.com/office/word/2012/wordml" xmlns:w16cex="http://schemas.microsoft.com/office/word/2018/wordml/cex" xmlns:w16cid="http://schemas.microsoft.com/office/word/2016/wordml/cid" xmlns:w16="http://schemas.microsoft.com/office/word/2018/wordml" xmlns:w16du="http://schemas.microsoft.com/office/word/2023/wordml/word16du" xmlns:w16sdtdh="http://schemas.microsoft.com/office/word/2020/wordml/sdtdatahash" xmlns:w16sdtfl="http://schemas.microsoft.com/office/word/2024/wordml/sdtformatlock" xmlns:w16se="http://schemas.microsoft.com/office/word/2015/wordml/symex" xmlns:wpg="http://schemas.microsoft.com/office/word/2010/wordprocessingGroup" xmlns:wpi="http://schemas.microsoft.com/office/word/2010/wordprocessingInk" xmlns:wne="http://schemas.microsoft.com/office/word/2006/wordml" xmlns:wps="http://schemas.microsoft.com/office/word/2010/wordprocessingShape" mc:Ignorable="w14 w15 w16se w16cid w16 w16cex w16sdtdh w16sdtfl w16du wp14">
   <w:p>
     <w:pPr>
-      <w:pStyle w:val="a4"/>
+      <w:pStyle w:val="Footer"/>
       <w:rPr>
         <w:rFonts w:ascii="BiauKai" w:eastAsia="BiauKai" w:hAnsi="BiauKai"/>
       </w:rPr>
@@ -1001,7 +1015,7 @@
     </w:pPr>
     <w:r>
       <w:rPr>
-        <w:rFonts w:ascii="BiauKai" w:eastAsia="BiauKai" w:hAnsi="BiauKai" w:hint="eastAsia"/>
+        <w:rFonts w:ascii="DFKai-SB" w:eastAsia="DFKai-SB" w:hAnsi="DFKai-SB" w:hint="eastAsia"/>
         <w:szCs w:val="24"/>
       </w:rPr>
       <w:t>新北市238樹林區長壽街15-5號4樓</w:t>
@@ -1023,7 +1037,7 @@
   </w:p>
   <w:p>
     <w:pPr>
-      <w:pStyle w:val="a4"/>
+      <w:pStyle w:val="Footer"/>
       <w:ind w:right="160"/>
       <w:jc w:val="right"/>
       <w:rPr>
@@ -1033,7 +1047,7 @@
   </w:p>
   <w:p>
     <w:pPr>
-      <w:pStyle w:val="a4"/>
+      <w:pStyle w:val="Footer"/>
       <w:rPr>
         <w:rFonts w:ascii="BiauKai" w:eastAsia="BiauKai" w:hAnsi="BiauKai"/>
       </w:rPr>
@@ -1065,11 +1079,11 @@
 <w:hdr xmlns:wpc="http://schemas.microsoft.com/office/word/2010/wordprocessingCanvas" xmlns:cx="http://schemas.microsoft.com/office/drawing/2014/chartex" xmlns:cx1="http://schemas.microsoft.com/office/drawing/2015/9/8/chartex" xmlns:cx2="http://schemas.microsoft.com/office/drawing/2015/10/21/chartex" xmlns:cx3="http://schemas.microsoft.com/office/drawing/2016/5/9/chartex" xmlns:cx4="http://schemas.microsoft.com/office/drawing/2016/5/10/chartex" xmlns:cx5="http://schemas.microsoft.com/office/drawing/2016/5/11/chartex" xmlns:cx6="http://schemas.microsoft.com/office/drawing/2016/5/12/chartex" xmlns:cx7="http://schemas.microsoft.com/office/drawing/2016/5/13/chartex" xmlns:cx8="http://schemas.microsoft.com/office/drawing/2016/5/14/chartex" xmlns:mc="http://schemas.openxmlformats.org/markup-compatibility/2006" xmlns:aink="http://schemas.microsoft.com/office/drawing/2016/ink" xmlns:am3d="http://schemas.microsoft.com/office/drawing/2017/model3d" xmlns:o="urn:schemas-microsoft-com:office:office" xmlns:oel="http://schemas.microsoft.com/office/2019/extlst" xmlns:r="http://schemas.openxmlformats.org/officeDocument/2006/relationships" xmlns:m="http://schemas.openxmlformats.org/officeDocument/2006/math" xmlns:v="urn:schemas-microsoft-com:vml" xmlns:wp14="http://schemas.microsoft.com/office/word/2010/wordprocessingDrawing" xmlns:wp="http://schemas.openxmlformats.org/drawingml/2006/wordprocessingDrawing" xmlns:w10="urn:schemas-microsoft-com:office:word" xmlns:w="http://schemas.openxmlformats.org/wordprocessingml/2006/main" xmlns:w14="http://schemas.microsoft.com/office/word/2010/wordml" xmlns:w15="http://schemas.microsoft.com/office/word/2012/wordml" xmlns:w16cex="http://schemas.microsoft.com/office/word/2018/wordml/cex" xmlns:w16cid="http://schemas.microsoft.com/office/word/2016/wordml/cid" xmlns:w16="http://schemas.microsoft.com/office/word/2018/wordml" xmlns:w16du="http://schemas.microsoft.com/office/word/2023/wordml/word16du" xmlns:w16sdtdh="http://schemas.microsoft.com/office/word/2020/wordml/sdtdatahash" xmlns:w16sdtfl="http://schemas.microsoft.com/office/word/2024/wordml/sdtformatlock" xmlns:w16se="http://schemas.microsoft.com/office/word/2015/wordml/symex" xmlns:wpg="http://schemas.microsoft.com/office/word/2010/wordprocessingGroup" xmlns:wpi="http://schemas.microsoft.com/office/word/2010/wordprocessingInk" xmlns:wne="http://schemas.microsoft.com/office/word/2006/wordml" xmlns:wps="http://schemas.microsoft.com/office/word/2010/wordprocessingShape" mc:Ignorable="w14 w15 w16se w16cid w16 w16cex w16sdtdh w16sdtfl w16du wp14">
   <w:p>
     <w:pPr>
-      <w:pStyle w:val="a3"/>
+      <w:pStyle w:val="Header"/>
       <w:jc w:val="center"/>
     </w:pPr>
     <w:r>
-      <w:pict w14:anchorId="00F36613">
+      <w:pict w14:anchorId="7BFD3D2C">
         <v:shapetype id="_x0000_t75" coordsize="21600,21600" o:spt="75" o:preferrelative="t" path="m@4@5l@4@11@9@11@9@5xe" filled="f" stroked="f">
           <v:stroke joinstyle="miter"/>
           <v:formulas>
@@ -1089,7 +1103,7 @@
           <v:path o:extrusionok="f" gradientshapeok="t" o:connecttype="rect"/>
           <o:lock v:ext="edit" aspectratio="t"/>
         </v:shapetype>
-        <v:shape id="_x0000_i1025" type="#_x0000_t75" alt="" style="width:138.05pt;height:27.1pt;mso-width-percent:0;mso-height-percent:0;mso-width-percent:0;mso-height-percent:0">
+        <v:shape id="_x0000_i1025" type="#_x0000_t75" alt="" style="width:137.7pt;height:27.15pt;mso-width-percent:0;mso-height-percent:0;mso-width-percent:0;mso-height-percent:0">
           <v:imagedata r:id="rId1" o:title="瑞肯logo"/>
         </v:shape>
       </w:pict>
@@ -1097,10 +1111,10 @@
   </w:p>
   <w:p>
     <w:pPr>
-      <w:pStyle w:val="a3"/>
+      <w:pStyle w:val="Header"/>
       <w:jc w:val="center"/>
       <w:rPr>
-        <w:rFonts w:ascii="Arial" w:eastAsia="標楷體" w:hAnsi="Arial" w:cs="Arial"/>
+        <w:rFonts w:ascii="Arial" w:eastAsia="DFKai-SB" w:hAnsi="Arial" w:cs="Arial"/>
         <w:sz w:val="22"/>
         <w:szCs w:val="22"/>
       </w:rPr>
@@ -1108,10 +1122,10 @@
   </w:p>
   <w:p>
     <w:pPr>
-      <w:pStyle w:val="a3"/>
+      <w:pStyle w:val="Header"/>
       <w:jc w:val="center"/>
       <w:rPr>
-        <w:rFonts w:ascii="BiauKai" w:eastAsia="BiauKai" w:hAnsi="BiauKai" w:cs="Arial"/>
+        <w:rFonts w:ascii="DFKai-SB" w:eastAsia="DFKai-SB" w:hAnsi="DFKai-SB" w:cs="Arial"/>
         <w:b/>
         <w:sz w:val="52"/>
         <w:szCs w:val="52"/>
@@ -1119,7 +1133,7 @@
     </w:pPr>
     <w:r>
       <w:rPr>
-        <w:rFonts w:ascii="BiauKai" w:eastAsia="BiauKai" w:hAnsi="BiauKai" w:cs="Arial" w:hint="eastAsia"/>
+        <w:rFonts w:ascii="DFKai-SB" w:eastAsia="DFKai-SB" w:hAnsi="DFKai-SB" w:cs="Arial" w:hint="eastAsia"/>
         <w:b/>
         <w:sz w:val="52"/>
         <w:szCs w:val="52"/>
@@ -1129,21 +1143,21 @@
   </w:p>
   <w:p>
     <w:pPr>
-      <w:pStyle w:val="a3"/>
+      <w:pStyle w:val="Header"/>
       <w:jc w:val="center"/>
       <w:rPr>
-        <w:rFonts w:ascii="Arial" w:eastAsia="標楷體" w:hAnsi="Arial" w:cs="Arial"/>
+        <w:rFonts w:ascii="Arial" w:eastAsia="DFKai-SB" w:hAnsi="Arial" w:cs="Arial"/>
         <w:sz w:val="48"/>
         <w:szCs w:val="48"/>
       </w:rPr>
     </w:pPr>
     <w:r>
       <w:rPr>
-        <w:rFonts w:ascii="Arial" w:eastAsia="標楷體" w:hAnsi="Arial" w:cs="Arial"/>
+        <w:rFonts w:ascii="Arial" w:eastAsia="DFKai-SB" w:hAnsi="Arial" w:cs="Arial"/>
         <w:sz w:val="48"/>
         <w:szCs w:val="48"/>
       </w:rPr>
-      <w:pict w14:anchorId="6C8C71CF">
+      <w:pict w14:anchorId="7D6109F7">
         <v:shapetype id="_x0000_t32" coordsize="21600,21600" o:spt="32" o:oned="t" path="m,l21600,21600e" filled="f">
           <v:path arrowok="t" fillok="f" o:connecttype="none"/>
           <o:lock v:ext="edit" shapetype="t"/>
@@ -1154,25 +1168,25 @@
   </w:p>
   <w:p>
     <w:pPr>
-      <w:pStyle w:val="a3"/>
+      <w:pStyle w:val="Header"/>
       <w:jc w:val="right"/>
       <w:rPr>
-        <w:rFonts w:ascii="Arial" w:eastAsia="標楷體" w:hAnsi="Arial" w:cs="Arial"/>
+        <w:rFonts w:ascii="Arial" w:eastAsia="DFKai-SB" w:hAnsi="Arial" w:cs="Arial"/>
       </w:rPr>
     </w:pPr>
     <w:r>
       <w:rPr>
-        <w:rFonts w:ascii="Arial" w:eastAsia="標楷體" w:hAnsi="Arial" w:cs="Arial" w:hint="eastAsia"/>
+        <w:rFonts w:ascii="Arial" w:eastAsia="DFKai-SB" w:hAnsi="Arial" w:cs="Arial" w:hint="eastAsia"/>
       </w:rPr>
       <w:t>P-003-04-A</w:t>
     </w:r>
   </w:p>
   <w:p>
     <w:pPr>
-      <w:pStyle w:val="a3"/>
+      <w:pStyle w:val="Header"/>
       <w:jc w:val="center"/>
       <w:rPr>
-        <w:rFonts w:ascii="Arial" w:eastAsia="標楷體" w:hAnsi="Arial" w:cs="Arial"/>
+        <w:rFonts w:ascii="Arial" w:eastAsia="DFKai-SB" w:hAnsi="Arial" w:cs="Arial"/>
         <w:sz w:val="48"/>
         <w:szCs w:val="48"/>
       </w:rPr>
@@ -1180,21 +1194,21 @@
   </w:p>
   <w:p>
     <w:pPr>
-      <w:pStyle w:val="a3"/>
+      <w:pStyle w:val="Header"/>
       <w:jc w:val="center"/>
       <w:rPr>
-        <w:rFonts w:ascii="Arial" w:eastAsia="標楷體" w:hAnsi="Arial" w:cs="Arial"/>
+        <w:rFonts w:ascii="Arial" w:eastAsia="DFKai-SB" w:hAnsi="Arial" w:cs="Arial"/>
         <w:sz w:val="48"/>
         <w:szCs w:val="48"/>
       </w:rPr>
     </w:pPr>
     <w:r>
       <w:rPr>
-        <w:rFonts w:ascii="Arial" w:eastAsia="標楷體" w:hAnsi="Arial" w:cs="Arial"/>
+        <w:rFonts w:ascii="Arial" w:eastAsia="DFKai-SB" w:hAnsi="Arial" w:cs="Arial"/>
         <w:sz w:val="48"/>
         <w:szCs w:val="48"/>
       </w:rPr>
-      <w:pict w14:anchorId="7B7C170D">
+      <w:pict w14:anchorId="0A638F12">
         <v:shapetype id="_x0000_t202" coordsize="21600,21600" o:spt="202" path="m,l,21600r21600,l21600,xe">
           <v:stroke joinstyle="miter"/>
           <v:path gradientshapeok="t" o:connecttype="rect"/>
@@ -1206,14 +1220,14 @@
                 <w:pPr>
                   <w:jc w:val="center"/>
                   <w:rPr>
-                    <w:rFonts w:ascii="BiauKai" w:eastAsia="BiauKai" w:hAnsi="BiauKai" w:cs="Arial"/>
+                    <w:rFonts w:ascii="DFKai-SB" w:eastAsia="DFKai-SB" w:hAnsi="DFKai-SB" w:cs="Arial"/>
                     <w:sz w:val="36"/>
                     <w:szCs w:val="36"/>
                   </w:rPr>
                 </w:pPr>
                 <w:r>
                   <w:rPr>
-                    <w:rFonts w:ascii="BiauKai" w:eastAsia="BiauKai" w:hAnsi="BiauKai" w:cs="Arial" w:hint="eastAsia"/>
+                    <w:rFonts w:ascii="DFKai-SB" w:eastAsia="DFKai-SB" w:hAnsi="DFKai-SB" w:cs="Arial" w:hint="eastAsia"/>
                     <w:sz w:val="36"/>
                     <w:szCs w:val="36"/>
                   </w:rPr>
@@ -1224,14 +1238,14 @@
                 <w:pPr>
                   <w:jc w:val="center"/>
                   <w:rPr>
-                    <w:rFonts w:ascii="Arial" w:eastAsia="標楷體" w:hAnsi="Arial" w:cs="Arial"/>
+                    <w:rFonts w:ascii="Arial" w:eastAsia="DFKai-SB" w:hAnsi="Arial" w:cs="Arial"/>
                     <w:sz w:val="28"/>
                     <w:szCs w:val="28"/>
                   </w:rPr>
                 </w:pPr>
                 <w:r>
                   <w:rPr>
-                    <w:rFonts w:ascii="Arial" w:eastAsia="標楷體" w:hAnsi="標楷體" w:cs="Arial" w:hint="eastAsia"/>
+                    <w:rFonts w:ascii="Arial" w:eastAsia="DFKai-SB" w:hAnsi="DFKai-SB" w:cs="Arial" w:hint="eastAsia"/>
                     <w:sz w:val="28"/>
                     <w:szCs w:val="28"/>
                   </w:rPr>
@@ -1246,22 +1260,22 @@
   </w:p>
   <w:p>
     <w:pPr>
-      <w:pStyle w:val="a3"/>
+      <w:pStyle w:val="Header"/>
     </w:pPr>
   </w:p>
   <w:p>
     <w:pPr>
-      <w:pStyle w:val="a3"/>
+      <w:pStyle w:val="Header"/>
     </w:pPr>
   </w:p>
   <w:p>
     <w:pPr>
-      <w:pStyle w:val="a3"/>
+      <w:pStyle w:val="Header"/>
     </w:pPr>
   </w:p>
   <w:p>
     <w:pPr>
-      <w:pStyle w:val="a3"/>
+      <w:pStyle w:val="Header"/>
     </w:pPr>
   </w:p>
 </w:hdr>
@@ -1574,8 +1588,8 @@
   <w:docDefaults>
     <w:rPrDefault>
       <w:rPr>
-        <w:rFonts w:ascii="Times New Roman" w:eastAsia="新細明體" w:hAnsi="Times New Roman" w:cs="Times New Roman"/>
-        <w:lang w:val="en-US" w:eastAsia="zh-TW" w:bidi="ar-SA"/>
+        <w:rFonts w:ascii="Times New Roman" w:eastAsia="PMingLiU" w:hAnsi="Times New Roman" w:cs="Times New Roman"/>
+        <w:lang w:val="en-AU" w:eastAsia="zh-TW" w:bidi="ar-SA"/>
       </w:rPr>
     </w:rPrDefault>
     <w:pPrDefault/>
@@ -1861,7 +1875,7 @@
     <w:lsdException w:name="Unresolved Mention" w:semiHidden="1" w:uiPriority="99" w:unhideWhenUsed="1"/>
     <w:lsdException w:name="Smart Link" w:semiHidden="1" w:uiPriority="99" w:unhideWhenUsed="1"/>
   </w:latentStyles>
-  <w:style w:type="paragraph" w:default="1" w:styleId="a">
+  <w:style w:type="paragraph" w:default="1" w:styleId="Normal">
     <w:name w:val="Normal"/>
     <w:qFormat/>
     <w:pPr>
@@ -1870,15 +1884,16 @@
     <w:rPr>
       <w:kern w:val="2"/>
       <w:sz w:val="24"/>
+      <w:lang w:val="en-US"/>
     </w:rPr>
   </w:style>
-  <w:style w:type="character" w:default="1" w:styleId="a0">
+  <w:style w:type="character" w:default="1" w:styleId="DefaultParagraphFont">
     <w:name w:val="Default Paragraph Font"/>
     <w:uiPriority w:val="1"/>
     <w:semiHidden/>
     <w:unhideWhenUsed/>
   </w:style>
-  <w:style w:type="table" w:default="1" w:styleId="a1">
+  <w:style w:type="table" w:default="1" w:styleId="TableNormal">
     <w:name w:val="Normal Table"/>
     <w:uiPriority w:val="99"/>
     <w:semiHidden/>
@@ -1893,7 +1908,7 @@
       </w:tblCellMar>
     </w:tblPr>
   </w:style>
-  <w:style w:type="numbering" w:default="1" w:styleId="a2">
+  <w:style w:type="numbering" w:default="1" w:styleId="NoList">
     <w:name w:val="No List"/>
     <w:uiPriority w:val="99"/>
     <w:semiHidden/>
@@ -1901,7 +1916,7 @@
   </w:style>
   <w:style w:type="paragraph" w:customStyle="1" w:styleId="pagetitle">
     <w:name w:val="pagetitle"/>
-    <w:basedOn w:val="a"/>
+    <w:basedOn w:val="Normal"/>
     <w:pPr>
       <w:widowControl/>
       <w:overflowPunct w:val="0"/>
@@ -1922,7 +1937,7 @@
   </w:style>
   <w:style w:type="paragraph" w:customStyle="1" w:styleId="cellbody">
     <w:name w:val="cellbody"/>
-    <w:basedOn w:val="a"/>
+    <w:basedOn w:val="Normal"/>
     <w:pPr>
       <w:widowControl/>
       <w:overflowPunct w:val="0"/>
@@ -1938,9 +1953,9 @@
       <w:kern w:val="0"/>
     </w:rPr>
   </w:style>
-  <w:style w:type="paragraph" w:styleId="a3">
+  <w:style w:type="paragraph" w:styleId="Header">
     <w:name w:val="header"/>
-    <w:basedOn w:val="a"/>
+    <w:basedOn w:val="Normal"/>
     <w:pPr>
       <w:widowControl/>
       <w:tabs>
@@ -1959,9 +1974,9 @@
       <w:sz w:val="20"/>
     </w:rPr>
   </w:style>
-  <w:style w:type="paragraph" w:styleId="a4">
+  <w:style w:type="paragraph" w:styleId="Footer">
     <w:name w:val="footer"/>
-    <w:basedOn w:val="a"/>
+    <w:basedOn w:val="Normal"/>
     <w:pPr>
       <w:widowControl/>
       <w:tabs>
@@ -1980,13 +1995,13 @@
       <w:sz w:val="20"/>
     </w:rPr>
   </w:style>
-  <w:style w:type="character" w:styleId="a5">
+  <w:style w:type="character" w:styleId="PageNumber">
     <w:name w:val="page number"/>
-    <w:basedOn w:val="a0"/>
+    <w:basedOn w:val="DefaultParagraphFont"/>
   </w:style>
-  <w:style w:type="paragraph" w:styleId="a6">
+  <w:style w:type="paragraph" w:styleId="BalloonText">
     <w:name w:val="Balloon Text"/>
-    <w:basedOn w:val="a"/>
+    <w:basedOn w:val="Normal"/>
     <w:semiHidden/>
     <w:rsid w:val="00A64500"/>
     <w:rPr>
@@ -1995,9 +2010,9 @@
       <w:szCs w:val="18"/>
     </w:rPr>
   </w:style>
-  <w:style w:type="table" w:styleId="a7">
+  <w:style w:type="table" w:styleId="TableGrid">
     <w:name w:val="Table Grid"/>
-    <w:basedOn w:val="a1"/>
+    <w:basedOn w:val="TableNormal"/>
     <w:rsid w:val="00FF39CF"/>
     <w:pPr>
       <w:widowControl w:val="0"/>
@@ -2013,10 +2028,10 @@
       </w:tblBorders>
     </w:tblPr>
   </w:style>
-  <w:style w:type="paragraph" w:styleId="a8">
+  <w:style w:type="paragraph" w:styleId="Date">
     <w:name w:val="Date"/>
-    <w:basedOn w:val="a"/>
-    <w:next w:val="a"/>
+    <w:basedOn w:val="Normal"/>
+    <w:next w:val="Normal"/>
     <w:rsid w:val="00DB0498"/>
     <w:pPr>
       <w:jc w:val="right"/>

</xml_diff>